<commit_message>
Fix DOCX rendering: XML escape <>, dates/Position conditionals, prompt improvements
- _trim_strings_deep: escape < and > to prevent broken DOCX XML on values like <<KB>>
- sanitize_json: strip punctuation-only project_description (e.g. ":")
- sanitize_json: add _is_mojibake() filter for garbled other_sections titles
- Prompt rule 5 & 7: duration-only dates (e.g. "6 years 5 months") → dates.start
- Prompt FINAL CHECK: add duration-in-dates.start reminder
- quantori_classic.docx: wrap dates line in {%p if dates.start or dates.end %}
- quantori_classic.docx: wrap Position in {%p if job.role %}
- main_03_50.py: persist window size to config on resize

Co-Authored-By: Claude Sonnet 4.6 <noreply@anthropic.com>
</commit_message>
<xml_diff>
--- a/quantori_classic.docx
+++ b/quantori_classic.docx
@@ -252,11 +252,35 @@
         </w:rPr>
       </w:pPr>
       <w:r>
+        <w:t xml:space="preserve">{%p if job.dates.start or job.dates.end %}</w:t>
+      </w:r>
+    </w:p>
+    <w:p>
+      <w:pPr>
+        <w:keepNext/>
         <w:rPr>
           <w:b/>
           <w:bCs/>
         </w:rPr>
-        <w:t>{{ job.dates.start }} – {{ job.dates.end }}</w:t>
+      </w:pPr>
+      <w:r>
+        <w:rPr>
+          <w:b/>
+          <w:bCs/>
+        </w:rPr>
+        <w:t>{{ job.dates.start }}{% if job.dates.start and job.dates.end %} – {% endif %}{{ job.dates.end }}</w:t>
+      </w:r>
+    </w:p>
+    <w:p>
+      <w:pPr>
+        <w:keepNext/>
+        <w:rPr>
+          <w:b/>
+          <w:bCs/>
+        </w:rPr>
+      </w:pPr>
+      <w:r>
+        <w:t xml:space="preserve">{%p endif %}</w:t>
       </w:r>
     </w:p>
     <w:p>
@@ -286,6 +310,14 @@
         <w:keepNext/>
       </w:pPr>
       <w:r>
+        <w:t xml:space="preserve">{%p if job.role %}</w:t>
+      </w:r>
+    </w:p>
+    <w:p>
+      <w:pPr>
+        <w:keepNext/>
+      </w:pPr>
+      <w:r>
         <w:rPr>
           <w:b/>
           <w:bCs/>
@@ -294,6 +326,14 @@
       </w:r>
       <w:r>
         <w:t xml:space="preserve"> {{ job.role }}</w:t>
+      </w:r>
+    </w:p>
+    <w:p>
+      <w:pPr>
+        <w:keepNext/>
+      </w:pPr>
+      <w:r>
+        <w:t xml:space="preserve">{%p endif %}</w:t>
       </w:r>
     </w:p>
     <w:p>

</xml_diff>